<commit_message>
docs: align proposal cover fields and title
</commit_message>
<xml_diff>
--- a/版本5/彭诗婕202528061023开题报告.docx
+++ b/版本5/彭诗婕202528061023开题报告.docx
@@ -54,12 +54,430 @@
       <w:pPr>
         <w:rPr>
           <w:rFonts w:hint="eastAsia"/>
-          <w:b/>
           <w:sz w:val="28"/>
-          <w:szCs w:val="48"/>
         </w:rPr>
       </w:pPr>
     </w:p>
+    <w:p>
+      <w:pPr>
+        <w:rPr>
+          <w:rFonts w:hint="eastAsia"/>
+          <w:sz w:val="28"/>
+        </w:rPr>
+      </w:pPr>
+    </w:p>
+    <w:tbl>
+      <w:tblPr>
+        <w:tblW w:type="dxa" w:w="4564"/>
+        <w:tblLayout w:type="fixed"/>
+        <w:tblLook w:firstColumn="1" w:firstRow="1" w:lastColumn="0" w:lastRow="0" w:noHBand="0" w:noVBand="1" w:val="04A0"/>
+        <w:tblInd w:w="1219" w:type="dxa"/>
+        <w:tblBorders>
+          <w:top w:val="nil"/>
+          <w:left w:val="nil"/>
+          <w:bottom w:val="nil"/>
+          <w:right w:val="nil"/>
+          <w:insideH w:val="nil"/>
+          <w:insideV w:val="nil"/>
+        </w:tblBorders>
+        <w:tblCellMar>
+          <w:top w:w="0" w:type="dxa"/>
+          <w:left w:w="0" w:type="dxa"/>
+          <w:bottom w:w="0" w:type="dxa"/>
+          <w:right w:w="0" w:type="dxa"/>
+        </w:tblCellMar>
+      </w:tblPr>
+      <w:tblGrid>
+        <w:gridCol w:w="2013"/>
+        <w:gridCol w:w="2551"/>
+      </w:tblGrid>
+      <w:tr>
+        <w:trPr>
+          <w:trHeight w:val="620" w:hRule="exact"/>
+        </w:trPr>
+        <w:tc>
+          <w:tcPr>
+            <w:tcW w:type="dxa" w:w="2013"/>
+            <w:vAlign w:val="center"/>
+          </w:tcPr>
+          <w:p>
+            <w:pPr>
+              <w:spacing w:before="0" w:after="0" w:line="440" w:lineRule="exact"/>
+              <w:ind w:firstLine="0"/>
+              <w:jc w:val="left"/>
+              <w:snapToGrid w:val="0"/>
+            </w:pPr>
+            <w:r>
+              <w:rPr>
+                <w:rFonts w:ascii="Times New Roman" w:hAnsi="Times New Roman" w:eastAsia="宋体"/>
+                <w:b w:val="0"/>
+                <w:sz w:val="28"/>
+                <w:u w:val="none"/>
+                <w:spacing w:val="140"/>
+              </w:rPr>
+              <w:t>研究生姓名</w:t>
+            </w:r>
+          </w:p>
+        </w:tc>
+        <w:tc>
+          <w:tcPr>
+            <w:tcW w:type="dxa" w:w="2551"/>
+            <w:vAlign w:val="center"/>
+          </w:tcPr>
+          <w:p>
+            <w:pPr>
+              <w:spacing w:before="0" w:after="0" w:line="440" w:lineRule="exact"/>
+              <w:ind w:firstLine="0"/>
+              <w:jc w:val="center"/>
+              <w:snapToGrid w:val="0"/>
+              <w:pBdr>
+                <w:bottom w:val="single" w:sz="6" w:space="0" w:color="000000"/>
+              </w:pBdr>
+            </w:pPr>
+            <w:r>
+              <w:rPr>
+                <w:rFonts w:ascii="Times New Roman" w:hAnsi="Times New Roman" w:eastAsia="宋体"/>
+                <w:b w:val="0"/>
+                <w:sz w:val="28"/>
+                <w:u w:val="none"/>
+              </w:rPr>
+              <w:t>彭诗婕</w:t>
+            </w:r>
+          </w:p>
+        </w:tc>
+      </w:tr>
+      <w:tr>
+        <w:trPr>
+          <w:trHeight w:val="620" w:hRule="exact"/>
+        </w:trPr>
+        <w:tc>
+          <w:tcPr>
+            <w:tcW w:type="dxa" w:w="2013"/>
+            <w:vAlign w:val="center"/>
+          </w:tcPr>
+          <w:p>
+            <w:pPr>
+              <w:spacing w:before="0" w:after="0" w:line="440" w:lineRule="exact"/>
+              <w:ind w:firstLine="0"/>
+              <w:jc w:val="left"/>
+              <w:snapToGrid w:val="0"/>
+            </w:pPr>
+            <w:r>
+              <w:rPr>
+                <w:rFonts w:ascii="Times New Roman" w:hAnsi="Times New Roman" w:eastAsia="宋体"/>
+                <w:b w:val="0"/>
+                <w:sz w:val="28"/>
+                <w:u w:val="none"/>
+                <w:spacing w:val="1400"/>
+              </w:rPr>
+              <w:t>学号</w:t>
+            </w:r>
+          </w:p>
+        </w:tc>
+        <w:tc>
+          <w:tcPr>
+            <w:tcW w:type="dxa" w:w="2551"/>
+            <w:vAlign w:val="center"/>
+          </w:tcPr>
+          <w:p>
+            <w:pPr>
+              <w:spacing w:before="0" w:after="0" w:line="440" w:lineRule="exact"/>
+              <w:ind w:firstLine="0"/>
+              <w:jc w:val="center"/>
+              <w:snapToGrid w:val="0"/>
+              <w:pBdr>
+                <w:bottom w:val="single" w:sz="6" w:space="0" w:color="000000"/>
+              </w:pBdr>
+            </w:pPr>
+            <w:r>
+              <w:rPr>
+                <w:rFonts w:ascii="Times New Roman" w:hAnsi="Times New Roman" w:eastAsia="宋体"/>
+                <w:b w:val="0"/>
+                <w:sz w:val="28"/>
+                <w:u w:val="none"/>
+              </w:rPr>
+              <w:t>202528061023</w:t>
+            </w:r>
+          </w:p>
+        </w:tc>
+      </w:tr>
+      <w:tr>
+        <w:trPr>
+          <w:trHeight w:val="620" w:hRule="exact"/>
+        </w:trPr>
+        <w:tc>
+          <w:tcPr>
+            <w:tcW w:type="dxa" w:w="2013"/>
+            <w:vAlign w:val="center"/>
+          </w:tcPr>
+          <w:p>
+            <w:pPr>
+              <w:spacing w:before="0" w:after="0" w:line="440" w:lineRule="exact"/>
+              <w:ind w:firstLine="0"/>
+              <w:jc w:val="left"/>
+              <w:snapToGrid w:val="0"/>
+            </w:pPr>
+            <w:r>
+              <w:rPr>
+                <w:rFonts w:ascii="Times New Roman" w:hAnsi="Times New Roman" w:eastAsia="宋体"/>
+                <w:b w:val="0"/>
+                <w:sz w:val="28"/>
+                <w:u w:val="none"/>
+                <w:spacing w:val="0"/>
+              </w:rPr>
+              <w:t>导师姓名、职称</w:t>
+            </w:r>
+          </w:p>
+        </w:tc>
+        <w:tc>
+          <w:tcPr>
+            <w:tcW w:type="dxa" w:w="2551"/>
+            <w:vAlign w:val="center"/>
+          </w:tcPr>
+          <w:p>
+            <w:pPr>
+              <w:spacing w:before="0" w:after="0" w:line="440" w:lineRule="exact"/>
+              <w:ind w:firstLine="0"/>
+              <w:jc w:val="center"/>
+              <w:snapToGrid w:val="0"/>
+              <w:pBdr>
+                <w:bottom w:val="single" w:sz="6" w:space="0" w:color="000000"/>
+              </w:pBdr>
+            </w:pPr>
+            <w:r>
+              <w:rPr>
+                <w:rFonts w:ascii="Times New Roman" w:hAnsi="Times New Roman" w:eastAsia="宋体"/>
+                <w:b w:val="0"/>
+                <w:sz w:val="28"/>
+                <w:u w:val="none"/>
+              </w:rPr>
+              <w:t>郑先隽教授</w:t>
+            </w:r>
+          </w:p>
+        </w:tc>
+      </w:tr>
+      <w:tr>
+        <w:trPr>
+          <w:trHeight w:val="620" w:hRule="exact"/>
+        </w:trPr>
+        <w:tc>
+          <w:tcPr>
+            <w:tcW w:type="dxa" w:w="2013"/>
+            <w:vAlign w:val="center"/>
+          </w:tcPr>
+          <w:p>
+            <w:pPr>
+              <w:spacing w:before="0" w:after="0" w:line="440" w:lineRule="exact"/>
+              <w:ind w:firstLine="0"/>
+              <w:jc w:val="left"/>
+              <w:snapToGrid w:val="0"/>
+            </w:pPr>
+            <w:r>
+              <w:rPr>
+                <w:rFonts w:ascii="Times New Roman" w:hAnsi="Times New Roman" w:eastAsia="宋体"/>
+                <w:b w:val="0"/>
+                <w:sz w:val="28"/>
+                <w:u w:val="none"/>
+                <w:spacing w:val="280"/>
+              </w:rPr>
+              <w:t>培养单位</w:t>
+            </w:r>
+          </w:p>
+        </w:tc>
+        <w:tc>
+          <w:tcPr>
+            <w:tcW w:type="dxa" w:w="2551"/>
+            <w:vAlign w:val="center"/>
+          </w:tcPr>
+          <w:p>
+            <w:pPr>
+              <w:spacing w:before="0" w:after="0" w:line="440" w:lineRule="exact"/>
+              <w:ind w:firstLine="0"/>
+              <w:jc w:val="center"/>
+              <w:snapToGrid w:val="0"/>
+              <w:pBdr>
+                <w:bottom w:val="single" w:sz="6" w:space="0" w:color="000000"/>
+              </w:pBdr>
+            </w:pPr>
+            <w:r>
+              <w:rPr>
+                <w:rFonts w:ascii="Times New Roman" w:hAnsi="Times New Roman" w:eastAsia="宋体"/>
+                <w:b w:val="0"/>
+                <w:sz w:val="28"/>
+                <w:u w:val="none"/>
+              </w:rPr>
+              <w:t>心理学部</w:t>
+            </w:r>
+          </w:p>
+        </w:tc>
+      </w:tr>
+      <w:tr>
+        <w:trPr>
+          <w:trHeight w:val="620" w:hRule="exact"/>
+        </w:trPr>
+        <w:tc>
+          <w:tcPr>
+            <w:tcW w:type="dxa" w:w="2013"/>
+            <w:vAlign w:val="center"/>
+          </w:tcPr>
+          <w:p>
+            <w:pPr>
+              <w:spacing w:before="0" w:after="0" w:line="440" w:lineRule="exact"/>
+              <w:ind w:firstLine="0"/>
+              <w:jc w:val="left"/>
+              <w:snapToGrid w:val="0"/>
+            </w:pPr>
+            <w:r>
+              <w:rPr>
+                <w:rFonts w:ascii="Times New Roman" w:hAnsi="Times New Roman" w:eastAsia="宋体"/>
+                <w:b w:val="0"/>
+                <w:sz w:val="28"/>
+                <w:u w:val="none"/>
+                <w:spacing w:val="1400"/>
+              </w:rPr>
+              <w:t>专业</w:t>
+            </w:r>
+          </w:p>
+        </w:tc>
+        <w:tc>
+          <w:tcPr>
+            <w:tcW w:type="dxa" w:w="2551"/>
+            <w:vAlign w:val="center"/>
+          </w:tcPr>
+          <w:p>
+            <w:pPr>
+              <w:spacing w:before="0" w:after="0" w:line="440" w:lineRule="exact"/>
+              <w:ind w:firstLine="0"/>
+              <w:jc w:val="center"/>
+              <w:snapToGrid w:val="0"/>
+              <w:pBdr>
+                <w:bottom w:val="single" w:sz="6" w:space="0" w:color="000000"/>
+              </w:pBdr>
+            </w:pPr>
+            <w:r>
+              <w:rPr>
+                <w:rFonts w:ascii="Times New Roman" w:hAnsi="Times New Roman" w:eastAsia="宋体"/>
+                <w:b w:val="0"/>
+                <w:sz w:val="28"/>
+                <w:u w:val="none"/>
+              </w:rPr>
+              <w:t>应用心理</w:t>
+            </w:r>
+          </w:p>
+        </w:tc>
+      </w:tr>
+      <w:tr>
+        <w:trPr>
+          <w:trHeight w:val="620" w:hRule="exact"/>
+        </w:trPr>
+        <w:tc>
+          <w:tcPr>
+            <w:tcW w:type="dxa" w:w="2013"/>
+            <w:vAlign w:val="center"/>
+          </w:tcPr>
+          <w:p>
+            <w:pPr>
+              <w:spacing w:before="0" w:after="0" w:line="440" w:lineRule="exact"/>
+              <w:ind w:firstLine="0"/>
+              <w:jc w:val="left"/>
+              <w:snapToGrid w:val="0"/>
+            </w:pPr>
+            <w:r>
+              <w:rPr>
+                <w:rFonts w:ascii="Times New Roman" w:hAnsi="Times New Roman" w:eastAsia="宋体"/>
+                <w:b w:val="0"/>
+                <w:sz w:val="28"/>
+                <w:u w:val="none"/>
+                <w:spacing w:val="280"/>
+              </w:rPr>
+              <w:t>研究方向</w:t>
+            </w:r>
+          </w:p>
+        </w:tc>
+        <w:tc>
+          <w:tcPr>
+            <w:tcW w:type="dxa" w:w="2551"/>
+            <w:vAlign w:val="center"/>
+          </w:tcPr>
+          <w:p>
+            <w:pPr>
+              <w:spacing w:before="0" w:after="0" w:line="440" w:lineRule="exact"/>
+              <w:ind w:firstLine="0"/>
+              <w:jc w:val="center"/>
+              <w:snapToGrid w:val="0"/>
+              <w:pBdr>
+                <w:bottom w:val="single" w:sz="6" w:space="0" w:color="000000"/>
+              </w:pBdr>
+            </w:pPr>
+            <w:r>
+              <w:rPr>
+                <w:rFonts w:ascii="Times New Roman" w:hAnsi="Times New Roman" w:eastAsia="宋体"/>
+                <w:b w:val="0"/>
+                <w:sz w:val="28"/>
+                <w:u w:val="none"/>
+              </w:rPr>
+              <w:t>用户体验</w:t>
+            </w:r>
+          </w:p>
+        </w:tc>
+      </w:tr>
+      <w:tr>
+        <w:trPr>
+          <w:trHeight w:val="620" w:hRule="exact"/>
+        </w:trPr>
+        <w:tc>
+          <w:tcPr>
+            <w:tcW w:type="dxa" w:w="2013"/>
+            <w:vAlign w:val="center"/>
+          </w:tcPr>
+          <w:p>
+            <w:pPr>
+              <w:spacing w:before="0" w:after="0" w:line="440" w:lineRule="exact"/>
+              <w:ind w:firstLine="0"/>
+              <w:jc w:val="left"/>
+              <w:snapToGrid w:val="0"/>
+            </w:pPr>
+            <w:r>
+              <w:rPr>
+                <w:rFonts w:ascii="Times New Roman" w:hAnsi="Times New Roman" w:eastAsia="宋体"/>
+                <w:b w:val="0"/>
+                <w:sz w:val="28"/>
+                <w:u w:val="none"/>
+                <w:spacing w:val="280"/>
+              </w:rPr>
+              <w:t>入学时间</w:t>
+            </w:r>
+          </w:p>
+        </w:tc>
+        <w:tc>
+          <w:tcPr>
+            <w:tcW w:type="dxa" w:w="2551"/>
+            <w:vAlign w:val="center"/>
+          </w:tcPr>
+          <w:p>
+            <w:pPr>
+              <w:spacing w:before="0" w:after="0" w:line="440" w:lineRule="exact"/>
+              <w:ind w:firstLine="0"/>
+              <w:jc w:val="center"/>
+              <w:snapToGrid w:val="0"/>
+              <w:pBdr>
+                <w:bottom w:val="single" w:sz="6" w:space="0" w:color="000000"/>
+              </w:pBdr>
+            </w:pPr>
+            <w:r>
+              <w:rPr>
+                <w:rFonts w:ascii="Times New Roman" w:hAnsi="Times New Roman" w:eastAsia="宋体"/>
+                <w:b w:val="0"/>
+                <w:sz w:val="28"/>
+                <w:u w:val="none"/>
+              </w:rPr>
+              <w:t>2025 年 9 月</w:t>
+            </w:r>
+          </w:p>
+        </w:tc>
+      </w:tr>
+    </w:tbl>
+    <w:bookmarkEnd w:id="0"/>
     <w:p>
       <w:pPr>
         <w:rPr>
@@ -73,303 +491,265 @@
         <w:rPr>
           <w:rFonts w:hint="eastAsia"/>
           <w:sz w:val="28"/>
-          <w:u w:val="single"/>
         </w:rPr>
+      </w:pPr>
+    </w:p>
+    <w:tbl>
+      <w:tblPr>
+        <w:tblW w:type="dxa" w:w="6946"/>
+        <w:tblLayout w:type="fixed"/>
+        <w:tblLook w:firstColumn="1" w:firstRow="1" w:lastColumn="0" w:lastRow="0" w:noHBand="0" w:noVBand="1" w:val="04A0"/>
+        <w:tblInd w:w="1219" w:type="dxa"/>
+        <w:tblBorders>
+          <w:top w:val="nil"/>
+          <w:left w:val="nil"/>
+          <w:bottom w:val="nil"/>
+          <w:right w:val="nil"/>
+          <w:insideH w:val="nil"/>
+          <w:insideV w:val="nil"/>
+        </w:tblBorders>
+        <w:tblCellMar>
+          <w:top w:w="0" w:type="dxa"/>
+          <w:left w:w="0" w:type="dxa"/>
+          <w:bottom w:w="0" w:type="dxa"/>
+          <w:right w:w="0" w:type="dxa"/>
+        </w:tblCellMar>
+      </w:tblPr>
+      <w:tblGrid>
+        <w:gridCol w:w="2013"/>
+        <w:gridCol w:w="4932"/>
+      </w:tblGrid>
+      <w:tr>
+        <w:trPr>
+          <w:trHeight w:val="620" w:hRule="exact"/>
+        </w:trPr>
+        <w:tc>
+          <w:tcPr>
+            <w:tcW w:type="dxa" w:w="2013"/>
+            <w:vAlign w:val="center"/>
+          </w:tcPr>
+          <w:p>
+            <w:pPr>
+              <w:spacing w:before="0" w:after="0" w:line="440" w:lineRule="exact"/>
+              <w:ind w:firstLine="0"/>
+              <w:jc w:val="left"/>
+              <w:snapToGrid w:val="0"/>
+            </w:pPr>
+            <w:r>
+              <w:rPr>
+                <w:rFonts w:ascii="Times New Roman" w:hAnsi="Times New Roman" w:eastAsia="宋体"/>
+                <w:b w:val="0"/>
+                <w:sz w:val="28"/>
+                <w:u w:val="none"/>
+                <w:spacing w:val="280"/>
+              </w:rPr>
+              <w:t>论文题目</w:t>
+            </w:r>
+          </w:p>
+        </w:tc>
+        <w:tc>
+          <w:tcPr>
+            <w:tcW w:type="dxa" w:w="4932"/>
+            <w:vAlign w:val="center"/>
+          </w:tcPr>
+          <w:p>
+            <w:pPr>
+              <w:spacing w:before="0" w:after="0" w:line="440" w:lineRule="exact"/>
+              <w:ind w:firstLine="0"/>
+              <w:jc w:val="center"/>
+              <w:snapToGrid w:val="0"/>
+              <w:pBdr>
+                <w:bottom w:val="single" w:sz="6" w:space="0" w:color="000000"/>
+              </w:pBdr>
+            </w:pPr>
+            <w:r>
+              <w:rPr>
+                <w:rFonts w:ascii="Times New Roman" w:hAnsi="Times New Roman" w:eastAsia="宋体"/>
+                <w:b w:val="0"/>
+                <w:sz w:val="28"/>
+                <w:u w:val="none"/>
+              </w:rPr>
+              <w:t>苏格拉底式智能体辅助阅读对科研新手</w:t>
+            </w:r>
+          </w:p>
+        </w:tc>
+      </w:tr>
+      <w:tr>
+        <w:trPr>
+          <w:trHeight w:val="620" w:hRule="exact"/>
+        </w:trPr>
+        <w:tc>
+          <w:tcPr>
+            <w:tcW w:type="dxa" w:w="2013"/>
+            <w:vAlign w:val="center"/>
+          </w:tcPr>
+          <w:p>
+            <w:pPr>
+              <w:spacing w:before="0" w:after="0" w:line="440" w:lineRule="exact"/>
+              <w:ind w:firstLine="0"/>
+              <w:jc w:val="left"/>
+              <w:snapToGrid w:val="0"/>
+            </w:pPr>
+            <w:r>
+              <w:rPr>
+                <w:rFonts w:ascii="Times New Roman" w:hAnsi="Times New Roman" w:eastAsia="宋体"/>
+                <w:b w:val="0"/>
+                <w:sz w:val="28"/>
+                <w:u w:val="none"/>
+              </w:rPr>
+            </w:r>
+          </w:p>
+        </w:tc>
+        <w:tc>
+          <w:tcPr>
+            <w:tcW w:type="dxa" w:w="4932"/>
+            <w:vAlign w:val="center"/>
+          </w:tcPr>
+          <w:p>
+            <w:pPr>
+              <w:spacing w:before="0" w:after="0" w:line="440" w:lineRule="exact"/>
+              <w:ind w:firstLine="0"/>
+              <w:jc w:val="center"/>
+              <w:snapToGrid w:val="0"/>
+              <w:pBdr>
+                <w:bottom w:val="single" w:sz="6" w:space="0" w:color="000000"/>
+              </w:pBdr>
+            </w:pPr>
+            <w:r>
+              <w:rPr>
+                <w:rFonts w:ascii="Times New Roman" w:hAnsi="Times New Roman" w:eastAsia="宋体"/>
+                <w:b w:val="0"/>
+                <w:sz w:val="28"/>
+                <w:u w:val="none"/>
+              </w:rPr>
+              <w:t>文献批判性评价表现的影响</w:t>
+            </w:r>
+          </w:p>
+        </w:tc>
+      </w:tr>
+    </w:tbl>
+    <w:p>
+      <w:pPr>
+        <w:spacing w:before="0" w:after="0" w:line="20" w:lineRule="exact"/>
+        <w:rPr>
+          <w:rFonts w:hint="eastAsia"/>
+          <w:sz w:val="28"/>
+        </w:rPr>
+        <w:snapToGrid w:val="0"/>
       </w:pPr>
       <w:r>
         <w:rPr>
-          <w:rFonts w:ascii="Times New Roman" w:hAnsi="Times New Roman" w:eastAsia="宋体"/>
-          <w:b w:val="0"/>
-          <w:i w:val="0"/>
-          <w:color w:val="000000"/>
-          <w:sz w:val="28"/>
+          <w:sz w:val="2"/>
         </w:rPr>
-        <w:t>研 究 生 姓 名  _____</w:t>
-      </w:r>
-      <w:r>
-        <w:rPr>
-          <w:rFonts w:hint="eastAsia" w:eastAsia="宋体"/>
-          <w:b w:val="0"/>
-          <w:i w:val="0"/>
-          <w:color w:val="000000"/>
-          <w:sz w:val="28"/>
-          <w:lang w:val="en-US" w:eastAsia="zh-CN"/>
-        </w:rPr>
-        <w:t>彭诗婕</w:t>
-      </w:r>
-      <w:r>
-        <w:rPr>
-          <w:rFonts w:ascii="Times New Roman" w:hAnsi="Times New Roman" w:eastAsia="宋体"/>
-          <w:b w:val="0"/>
-          <w:i w:val="0"/>
-          <w:color w:val="000000"/>
-          <w:sz w:val="28"/>
-        </w:rPr>
-        <w:t>_____________</w:t>
       </w:r>
     </w:p>
     <w:p>
       <w:pPr>
+        <w:spacing w:before="0" w:after="0" w:line="20" w:lineRule="exact"/>
         <w:rPr>
+          <w:rFonts w:hint="eastAsia"/>
           <w:sz w:val="28"/>
-          <w:u w:val="single"/>
         </w:rPr>
+        <w:snapToGrid w:val="0"/>
       </w:pPr>
       <w:r>
         <w:rPr>
-          <w:rFonts w:ascii="Times New Roman" w:hAnsi="Times New Roman" w:eastAsia="宋体"/>
-          <w:b w:val="0"/>
-          <w:i w:val="0"/>
-          <w:color w:val="000000"/>
-          <w:sz w:val="28"/>
+          <w:sz w:val="2"/>
         </w:rPr>
-        <w:t>学        号  ____</w:t>
-      </w:r>
-      <w:r>
-        <w:rPr>
-          <w:rFonts w:hint="eastAsia" w:eastAsia="宋体"/>
-          <w:b w:val="0"/>
-          <w:i w:val="0"/>
-          <w:color w:val="000000"/>
-          <w:sz w:val="28"/>
-          <w:lang w:val="en-US" w:eastAsia="zh-CN"/>
-        </w:rPr>
-        <w:t>202528061023</w:t>
-      </w:r>
-      <w:r>
-        <w:rPr>
-          <w:rFonts w:ascii="Times New Roman" w:hAnsi="Times New Roman" w:eastAsia="宋体"/>
-          <w:b w:val="0"/>
-          <w:i w:val="0"/>
-          <w:color w:val="000000"/>
-          <w:sz w:val="28"/>
-        </w:rPr>
-        <w:t>_____________</w:t>
       </w:r>
     </w:p>
     <w:p>
       <w:pPr>
+        <w:spacing w:before="0" w:after="0" w:line="20" w:lineRule="exact"/>
         <w:rPr>
           <w:rFonts w:hint="eastAsia"/>
-          <w:sz w:val="28"/>
-          <w:u w:val="single"/>
         </w:rPr>
+        <w:snapToGrid w:val="0"/>
       </w:pPr>
       <w:r>
         <w:rPr>
-          <w:rFonts w:ascii="Times New Roman" w:hAnsi="Times New Roman" w:eastAsia="宋体"/>
-          <w:b w:val="0"/>
-          <w:i w:val="0"/>
-          <w:color w:val="000000"/>
-          <w:sz w:val="28"/>
+          <w:sz w:val="2"/>
         </w:rPr>
-        <w:t>导师姓名、职称  ___</w:t>
-      </w:r>
-      <w:r>
-        <w:rPr>
-          <w:rFonts w:hint="eastAsia" w:eastAsia="宋体"/>
-          <w:b w:val="0"/>
-          <w:i w:val="0"/>
-          <w:color w:val="000000"/>
-          <w:sz w:val="28"/>
-          <w:lang w:val="en-US" w:eastAsia="zh-CN"/>
-        </w:rPr>
-        <w:t>郑先隽 教授</w:t>
-      </w:r>
-      <w:r>
-        <w:rPr>
-          <w:rFonts w:ascii="Times New Roman" w:hAnsi="Times New Roman" w:eastAsia="宋体"/>
-          <w:b w:val="0"/>
-          <w:i w:val="0"/>
-          <w:color w:val="000000"/>
-          <w:sz w:val="28"/>
-        </w:rPr>
-        <w:t>__________</w:t>
       </w:r>
     </w:p>
     <w:p>
       <w:pPr>
+        <w:spacing w:before="0" w:after="0" w:line="20" w:lineRule="exact"/>
         <w:rPr>
           <w:rFonts w:hint="eastAsia"/>
-          <w:sz w:val="28"/>
-          <w:u w:val="single"/>
         </w:rPr>
+        <w:snapToGrid w:val="0"/>
       </w:pPr>
       <w:r>
         <w:rPr>
-          <w:rFonts w:hint="eastAsia"/>
-          <w:sz w:val="28"/>
+          <w:sz w:val="2"/>
         </w:rPr>
-        <w:t xml:space="preserve">           培  养  单  位</w:t>
-      </w:r>
-      <w:r>
-        <w:rPr>
-          <w:rFonts w:hint="eastAsia"/>
-          <w:sz w:val="28"/>
-          <w:u w:val="single"/>
-        </w:rPr>
-        <w:t xml:space="preserve">   心理学部      </w:t>
       </w:r>
     </w:p>
     <w:p>
       <w:pPr>
+        <w:spacing w:before="0" w:after="0" w:line="20" w:lineRule="exact"/>
+        <w:jc w:val="right"/>
         <w:rPr>
           <w:rFonts w:hint="eastAsia"/>
-          <w:sz w:val="28"/>
-          <w:u w:val="single"/>
+          <w:sz w:val="24"/>
+          <w:szCs w:val="24"/>
         </w:rPr>
+        <w:snapToGrid w:val="0"/>
       </w:pPr>
       <w:r>
         <w:rPr>
-          <w:rFonts w:hint="eastAsia"/>
-          <w:sz w:val="28"/>
+          <w:sz w:val="2"/>
         </w:rPr>
-        <w:t xml:space="preserve">           专          业</w:t>
-      </w:r>
-      <w:r>
-        <w:rPr>
-          <w:rFonts w:hint="eastAsia"/>
-          <w:sz w:val="28"/>
-          <w:u w:val="single"/>
-        </w:rPr>
-        <w:t xml:space="preserve">   应用心理     </w:t>
       </w:r>
     </w:p>
     <w:p>
       <w:pPr>
-        <w:spacing w:line="336" w:lineRule="auto"/>
+        <w:spacing w:before="0" w:after="0" w:line="20" w:lineRule="exact"/>
+        <w:jc w:val="right"/>
         <w:rPr>
           <w:rFonts w:hint="eastAsia"/>
-          <w:sz w:val="28"/>
-          <w:u w:val="single"/>
+          <w:sz w:val="24"/>
+          <w:szCs w:val="24"/>
         </w:rPr>
+        <w:snapToGrid w:val="0"/>
       </w:pPr>
       <w:r>
         <w:rPr>
-          <w:rFonts w:ascii="Times New Roman" w:hAnsi="Times New Roman" w:eastAsia="宋体"/>
-          <w:b w:val="0"/>
-          <w:i w:val="0"/>
-          <w:color w:val="000000"/>
-          <w:sz w:val="28"/>
+          <w:sz w:val="2"/>
         </w:rPr>
-        <w:t>研 究 方 向  用户体验（UX）</w:t>
       </w:r>
     </w:p>
     <w:p>
       <w:pPr>
+        <w:spacing w:before="0" w:after="0" w:line="20" w:lineRule="exact"/>
         <w:rPr>
           <w:rFonts w:hint="eastAsia"/>
+          <w:b/>
           <w:sz w:val="28"/>
-          <w:u w:val="single"/>
         </w:rPr>
+        <w:snapToGrid w:val="0"/>
       </w:pPr>
       <w:r>
         <w:rPr>
-          <w:rFonts w:hint="eastAsia"/>
-          <w:sz w:val="28"/>
+          <w:sz w:val="2"/>
         </w:rPr>
-        <w:t xml:space="preserve">           入  学  时  间</w:t>
-      </w:r>
-      <w:r>
-        <w:rPr>
-          <w:rFonts w:hint="eastAsia"/>
-          <w:sz w:val="28"/>
-          <w:u w:val="single"/>
-        </w:rPr>
-        <w:t xml:space="preserve">   20</w:t>
-      </w:r>
-      <w:r>
-        <w:rPr>
-          <w:rFonts w:hint="eastAsia"/>
-          <w:sz w:val="28"/>
-          <w:u w:val="single"/>
-          <w:lang w:val="en-US" w:eastAsia="zh-CN"/>
-        </w:rPr>
-        <w:t>25</w:t>
-      </w:r>
-      <w:r>
-        <w:rPr>
-          <w:rFonts w:hint="eastAsia"/>
-          <w:sz w:val="28"/>
-          <w:u w:val="single"/>
-        </w:rPr>
-        <w:t xml:space="preserve">   年  </w:t>
-      </w:r>
-      <w:r>
-        <w:rPr>
-          <w:rFonts w:hint="eastAsia"/>
-          <w:sz w:val="28"/>
-          <w:u w:val="single"/>
-          <w:lang w:val="en-US" w:eastAsia="zh-CN"/>
-        </w:rPr>
-        <w:t>9</w:t>
-      </w:r>
-      <w:r>
-        <w:rPr>
-          <w:rFonts w:hint="eastAsia"/>
-          <w:sz w:val="28"/>
-          <w:u w:val="single"/>
-        </w:rPr>
-        <w:t xml:space="preserve"> 月  </w:t>
-      </w:r>
-      <w:bookmarkStart w:id="0" w:name="_GoBack"/>
-      <w:bookmarkEnd w:id="0"/>
-    </w:p>
-    <w:p>
-      <w:pPr>
-        <w:rPr>
-          <w:rFonts w:hint="eastAsia"/>
-          <w:sz w:val="28"/>
-          <w:u w:val="single"/>
-        </w:rPr>
-      </w:pPr>
-    </w:p>
-    <w:p>
-      <w:pPr>
-        <w:rPr>
-          <w:rFonts w:hint="eastAsia"/>
-          <w:sz w:val="28"/>
-        </w:rPr>
-      </w:pPr>
-    </w:p>
-    <w:p>
-      <w:pPr>
-        <w:spacing w:line="336" w:lineRule="auto"/>
-        <w:rPr>
-          <w:rFonts w:hint="eastAsia"/>
-          <w:sz w:val="28"/>
-          <w:u w:val="single"/>
-        </w:rPr>
-      </w:pPr>
-      <w:r>
-        <w:rPr>
-          <w:rFonts w:ascii="Times New Roman" w:hAnsi="Times New Roman" w:eastAsia="宋体"/>
-          <w:b w:val="0"/>
-          <w:i w:val="0"/>
-          <w:color w:val="000000"/>
-          <w:sz w:val="28"/>
-        </w:rPr>
-        <w:t>论 文 题 目  苏格拉底式智能体辅助阅读对科研新手</w:t>
       </w:r>
     </w:p>
     <w:p>
       <w:pPr>
-        <w:spacing w:line="336" w:lineRule="auto"/>
+        <w:spacing w:before="0" w:after="0" w:line="20" w:lineRule="exact"/>
         <w:rPr>
           <w:rFonts w:hint="eastAsia"/>
+          <w:bCs/>
           <w:sz w:val="28"/>
-          <w:u w:val="single"/>
         </w:rPr>
+        <w:snapToGrid w:val="0"/>
       </w:pPr>
       <w:r>
         <w:rPr>
-          <w:rFonts w:ascii="Times New Roman" w:hAnsi="Times New Roman" w:eastAsia="宋体"/>
-          <w:b w:val="0"/>
-          <w:i w:val="0"/>
-          <w:color w:val="000000"/>
-          <w:sz w:val="28"/>
+          <w:sz w:val="2"/>
         </w:rPr>
-        <w:t xml:space="preserve">                    文献批判性评价表现的影响</w:t>
       </w:r>
     </w:p>
     <w:p>

</xml_diff>

<commit_message>
Update latest revised thesis proposal
</commit_message>
<xml_diff>
--- a/版本5/彭诗婕202528061023开题报告.docx
+++ b/版本5/彭诗婕202528061023开题报告.docx
@@ -14,24 +14,42 @@
     </w:p>
     <w:p>
       <w:pPr>
+        <w:spacing w:line="480" w:lineRule="auto"/>
         <w:jc w:val="center"/>
         <w:rPr>
-          <w:rFonts w:hint="eastAsia"/>
+          <w:rFonts w:hint="eastAsia" w:ascii="宋体" w:hAnsi="宋体" w:eastAsia="宋体" w:cs="宋体"/>
           <w:b/>
-          <w:sz w:val="72"/>
+          <w:kern w:val="0"/>
+          <w:sz w:val="13"/>
+          <w:szCs w:val="13"/>
         </w:rPr>
       </w:pPr>
       <w:r>
         <w:rPr>
-          <w:rFonts w:hint="eastAsia"/>
+          <w:rFonts w:hint="eastAsia" w:ascii="宋体" w:hAnsi="宋体" w:eastAsia="宋体" w:cs="宋体"/>
           <w:b/>
+          <w:spacing w:val="91"/>
+          <w:kern w:val="0"/>
           <w:sz w:val="72"/>
+          <w:fitText w:val="6120" w:id="-27507"/>
         </w:rPr>
-        <w:t>北 京 师 范 大 学</w:t>
+        <w:t xml:space="preserve">北 京 师 范 大 </w:t>
+      </w:r>
+      <w:r>
+        <w:rPr>
+          <w:rFonts w:hint="eastAsia" w:ascii="宋体" w:hAnsi="宋体" w:eastAsia="宋体" w:cs="宋体"/>
+          <w:b/>
+          <w:spacing w:val="4"/>
+          <w:kern w:val="0"/>
+          <w:sz w:val="72"/>
+          <w:fitText w:val="6120" w:id="-27507"/>
+        </w:rPr>
+        <w:t>学</w:t>
       </w:r>
     </w:p>
     <w:p>
       <w:pPr>
+        <w:spacing w:line="480" w:lineRule="auto"/>
         <w:jc w:val="center"/>
         <w:rPr>
           <w:rFonts w:hint="eastAsia"/>
@@ -49,6 +67,8 @@
         </w:rPr>
         <w:t>硕士研究生学位论文开题报告</w:t>
       </w:r>
+      <w:bookmarkStart w:id="0" w:name="_GoBack"/>
+      <w:bookmarkEnd w:id="0"/>
     </w:p>
     <w:p>
       <w:pPr>
@@ -68,18 +88,18 @@
     </w:p>
     <w:tbl>
       <w:tblPr>
-        <w:tblW w:type="dxa" w:w="4564"/>
+        <w:tblStyle w:val="7"/>
+        <w:tblW w:w="5225" w:type="dxa"/>
+        <w:tblInd w:w="1507" w:type="dxa"/>
+        <w:tblBorders>
+          <w:top w:val="none" w:color="auto" w:sz="0" w:space="0"/>
+          <w:left w:val="none" w:color="auto" w:sz="0" w:space="0"/>
+          <w:bottom w:val="none" w:color="auto" w:sz="0" w:space="0"/>
+          <w:right w:val="none" w:color="auto" w:sz="0" w:space="0"/>
+          <w:insideH w:val="none" w:color="auto" w:sz="0" w:space="0"/>
+          <w:insideV w:val="none" w:color="auto" w:sz="0" w:space="0"/>
+        </w:tblBorders>
         <w:tblLayout w:type="fixed"/>
-        <w:tblLook w:firstColumn="1" w:firstRow="1" w:lastColumn="0" w:lastRow="0" w:noHBand="0" w:noVBand="1" w:val="04A0"/>
-        <w:tblInd w:w="1219" w:type="dxa"/>
-        <w:tblBorders>
-          <w:top w:val="nil"/>
-          <w:left w:val="nil"/>
-          <w:bottom w:val="nil"/>
-          <w:right w:val="nil"/>
-          <w:insideH w:val="nil"/>
-          <w:insideV w:val="nil"/>
-        </w:tblBorders>
         <w:tblCellMar>
           <w:top w:w="0" w:type="dxa"/>
           <w:left w:w="0" w:type="dxa"/>
@@ -88,24 +108,25 @@
         </w:tblCellMar>
       </w:tblPr>
       <w:tblGrid>
-        <w:gridCol w:w="2013"/>
-        <w:gridCol w:w="2551"/>
+        <w:gridCol w:w="2072"/>
+        <w:gridCol w:w="3153"/>
       </w:tblGrid>
       <w:tr>
         <w:trPr>
-          <w:trHeight w:val="620" w:hRule="exact"/>
+          <w:trHeight w:val="620" w:hRule="atLeast"/>
         </w:trPr>
         <w:tc>
           <w:tcPr>
-            <w:tcW w:type="dxa" w:w="2013"/>
+            <w:tcW w:w="2072" w:type="dxa"/>
+            <w:noWrap/>
             <w:vAlign w:val="center"/>
           </w:tcPr>
           <w:p>
             <w:pPr>
+              <w:snapToGrid w:val="0"/>
               <w:spacing w:before="0" w:after="0" w:line="440" w:lineRule="exact"/>
-              <w:ind w:firstLine="0"/>
-              <w:jc w:val="left"/>
-              <w:snapToGrid w:val="0"/>
+              <w:ind w:right="60" w:firstLine="0"/>
+              <w:jc w:val="distribute"/>
             </w:pPr>
             <w:r>
               <w:rPr>
@@ -113,7 +134,6 @@
                 <w:b w:val="0"/>
                 <w:sz w:val="28"/>
                 <w:u w:val="none"/>
-                <w:spacing w:val="140"/>
               </w:rPr>
               <w:t>研究生姓名</w:t>
             </w:r>
@@ -121,18 +141,18 @@
         </w:tc>
         <w:tc>
           <w:tcPr>
-            <w:tcW w:type="dxa" w:w="2551"/>
+            <w:tcW w:w="3153" w:type="dxa"/>
             <w:vAlign w:val="center"/>
           </w:tcPr>
           <w:p>
             <w:pPr>
+              <w:pBdr>
+                <w:bottom w:val="single" w:color="000000" w:sz="6" w:space="0"/>
+              </w:pBdr>
+              <w:snapToGrid w:val="0"/>
               <w:spacing w:before="0" w:after="0" w:line="440" w:lineRule="exact"/>
               <w:ind w:firstLine="0"/>
               <w:jc w:val="center"/>
-              <w:snapToGrid w:val="0"/>
-              <w:pBdr>
-                <w:bottom w:val="single" w:sz="6" w:space="0" w:color="000000"/>
-              </w:pBdr>
             </w:pPr>
             <w:r>
               <w:rPr>
@@ -148,19 +168,20 @@
       </w:tr>
       <w:tr>
         <w:trPr>
-          <w:trHeight w:val="620" w:hRule="exact"/>
+          <w:trHeight w:val="620" w:hRule="atLeast"/>
         </w:trPr>
         <w:tc>
           <w:tcPr>
-            <w:tcW w:type="dxa" w:w="2013"/>
+            <w:tcW w:w="2072" w:type="dxa"/>
+            <w:noWrap/>
             <w:vAlign w:val="center"/>
           </w:tcPr>
           <w:p>
             <w:pPr>
+              <w:snapToGrid w:val="0"/>
               <w:spacing w:before="0" w:after="0" w:line="440" w:lineRule="exact"/>
-              <w:ind w:firstLine="0"/>
-              <w:jc w:val="left"/>
-              <w:snapToGrid w:val="0"/>
+              <w:ind w:right="60" w:firstLine="0"/>
+              <w:jc w:val="distribute"/>
             </w:pPr>
             <w:r>
               <w:rPr>
@@ -168,7 +189,6 @@
                 <w:b w:val="0"/>
                 <w:sz w:val="28"/>
                 <w:u w:val="none"/>
-                <w:spacing w:val="1400"/>
               </w:rPr>
               <w:t>学号</w:t>
             </w:r>
@@ -176,18 +196,18 @@
         </w:tc>
         <w:tc>
           <w:tcPr>
-            <w:tcW w:type="dxa" w:w="2551"/>
+            <w:tcW w:w="3153" w:type="dxa"/>
             <w:vAlign w:val="center"/>
           </w:tcPr>
           <w:p>
             <w:pPr>
+              <w:pBdr>
+                <w:bottom w:val="single" w:color="000000" w:sz="6" w:space="0"/>
+              </w:pBdr>
+              <w:snapToGrid w:val="0"/>
               <w:spacing w:before="0" w:after="0" w:line="440" w:lineRule="exact"/>
               <w:ind w:firstLine="0"/>
               <w:jc w:val="center"/>
-              <w:snapToGrid w:val="0"/>
-              <w:pBdr>
-                <w:bottom w:val="single" w:sz="6" w:space="0" w:color="000000"/>
-              </w:pBdr>
             </w:pPr>
             <w:r>
               <w:rPr>
@@ -203,19 +223,20 @@
       </w:tr>
       <w:tr>
         <w:trPr>
-          <w:trHeight w:val="620" w:hRule="exact"/>
+          <w:trHeight w:val="620" w:hRule="atLeast"/>
         </w:trPr>
         <w:tc>
           <w:tcPr>
-            <w:tcW w:type="dxa" w:w="2013"/>
+            <w:tcW w:w="2072" w:type="dxa"/>
+            <w:noWrap/>
             <w:vAlign w:val="center"/>
           </w:tcPr>
           <w:p>
             <w:pPr>
+              <w:snapToGrid w:val="0"/>
               <w:spacing w:before="0" w:after="0" w:line="440" w:lineRule="exact"/>
-              <w:ind w:firstLine="0"/>
-              <w:jc w:val="left"/>
-              <w:snapToGrid w:val="0"/>
+              <w:ind w:right="60" w:firstLine="0"/>
+              <w:jc w:val="distribute"/>
             </w:pPr>
             <w:r>
               <w:rPr>
@@ -223,7 +244,6 @@
                 <w:b w:val="0"/>
                 <w:sz w:val="28"/>
                 <w:u w:val="none"/>
-                <w:spacing w:val="0"/>
               </w:rPr>
               <w:t>导师姓名、职称</w:t>
             </w:r>
@@ -231,18 +251,18 @@
         </w:tc>
         <w:tc>
           <w:tcPr>
-            <w:tcW w:type="dxa" w:w="2551"/>
+            <w:tcW w:w="3153" w:type="dxa"/>
             <w:vAlign w:val="center"/>
           </w:tcPr>
           <w:p>
             <w:pPr>
+              <w:pBdr>
+                <w:bottom w:val="single" w:color="000000" w:sz="6" w:space="0"/>
+              </w:pBdr>
+              <w:snapToGrid w:val="0"/>
               <w:spacing w:before="0" w:after="0" w:line="440" w:lineRule="exact"/>
               <w:ind w:firstLine="0"/>
               <w:jc w:val="center"/>
-              <w:snapToGrid w:val="0"/>
-              <w:pBdr>
-                <w:bottom w:val="single" w:sz="6" w:space="0" w:color="000000"/>
-              </w:pBdr>
             </w:pPr>
             <w:r>
               <w:rPr>
@@ -258,19 +278,20 @@
       </w:tr>
       <w:tr>
         <w:trPr>
-          <w:trHeight w:val="620" w:hRule="exact"/>
+          <w:trHeight w:val="620" w:hRule="atLeast"/>
         </w:trPr>
         <w:tc>
           <w:tcPr>
-            <w:tcW w:type="dxa" w:w="2013"/>
+            <w:tcW w:w="2072" w:type="dxa"/>
+            <w:noWrap/>
             <w:vAlign w:val="center"/>
           </w:tcPr>
           <w:p>
             <w:pPr>
+              <w:snapToGrid w:val="0"/>
               <w:spacing w:before="0" w:after="0" w:line="440" w:lineRule="exact"/>
-              <w:ind w:firstLine="0"/>
-              <w:jc w:val="left"/>
-              <w:snapToGrid w:val="0"/>
+              <w:ind w:right="60" w:firstLine="0"/>
+              <w:jc w:val="distribute"/>
             </w:pPr>
             <w:r>
               <w:rPr>
@@ -278,7 +299,6 @@
                 <w:b w:val="0"/>
                 <w:sz w:val="28"/>
                 <w:u w:val="none"/>
-                <w:spacing w:val="280"/>
               </w:rPr>
               <w:t>培养单位</w:t>
             </w:r>
@@ -286,18 +306,18 @@
         </w:tc>
         <w:tc>
           <w:tcPr>
-            <w:tcW w:type="dxa" w:w="2551"/>
+            <w:tcW w:w="3153" w:type="dxa"/>
             <w:vAlign w:val="center"/>
           </w:tcPr>
           <w:p>
             <w:pPr>
+              <w:pBdr>
+                <w:bottom w:val="single" w:color="000000" w:sz="6" w:space="0"/>
+              </w:pBdr>
+              <w:snapToGrid w:val="0"/>
               <w:spacing w:before="0" w:after="0" w:line="440" w:lineRule="exact"/>
               <w:ind w:firstLine="0"/>
               <w:jc w:val="center"/>
-              <w:snapToGrid w:val="0"/>
-              <w:pBdr>
-                <w:bottom w:val="single" w:sz="6" w:space="0" w:color="000000"/>
-              </w:pBdr>
             </w:pPr>
             <w:r>
               <w:rPr>
@@ -313,19 +333,20 @@
       </w:tr>
       <w:tr>
         <w:trPr>
-          <w:trHeight w:val="620" w:hRule="exact"/>
+          <w:trHeight w:val="620" w:hRule="atLeast"/>
         </w:trPr>
         <w:tc>
           <w:tcPr>
-            <w:tcW w:type="dxa" w:w="2013"/>
+            <w:tcW w:w="2072" w:type="dxa"/>
+            <w:noWrap/>
             <w:vAlign w:val="center"/>
           </w:tcPr>
           <w:p>
             <w:pPr>
+              <w:snapToGrid w:val="0"/>
               <w:spacing w:before="0" w:after="0" w:line="440" w:lineRule="exact"/>
-              <w:ind w:firstLine="0"/>
-              <w:jc w:val="left"/>
-              <w:snapToGrid w:val="0"/>
+              <w:ind w:right="60" w:firstLine="0"/>
+              <w:jc w:val="distribute"/>
             </w:pPr>
             <w:r>
               <w:rPr>
@@ -333,7 +354,6 @@
                 <w:b w:val="0"/>
                 <w:sz w:val="28"/>
                 <w:u w:val="none"/>
-                <w:spacing w:val="1400"/>
               </w:rPr>
               <w:t>专业</w:t>
             </w:r>
@@ -341,18 +361,18 @@
         </w:tc>
         <w:tc>
           <w:tcPr>
-            <w:tcW w:type="dxa" w:w="2551"/>
+            <w:tcW w:w="3153" w:type="dxa"/>
             <w:vAlign w:val="center"/>
           </w:tcPr>
           <w:p>
             <w:pPr>
+              <w:pBdr>
+                <w:bottom w:val="single" w:color="000000" w:sz="6" w:space="0"/>
+              </w:pBdr>
+              <w:snapToGrid w:val="0"/>
               <w:spacing w:before="0" w:after="0" w:line="440" w:lineRule="exact"/>
               <w:ind w:firstLine="0"/>
               <w:jc w:val="center"/>
-              <w:snapToGrid w:val="0"/>
-              <w:pBdr>
-                <w:bottom w:val="single" w:sz="6" w:space="0" w:color="000000"/>
-              </w:pBdr>
             </w:pPr>
             <w:r>
               <w:rPr>
@@ -368,19 +388,20 @@
       </w:tr>
       <w:tr>
         <w:trPr>
-          <w:trHeight w:val="620" w:hRule="exact"/>
+          <w:trHeight w:val="620" w:hRule="atLeast"/>
         </w:trPr>
         <w:tc>
           <w:tcPr>
-            <w:tcW w:type="dxa" w:w="2013"/>
+            <w:tcW w:w="2072" w:type="dxa"/>
+            <w:noWrap/>
             <w:vAlign w:val="center"/>
           </w:tcPr>
           <w:p>
             <w:pPr>
+              <w:snapToGrid w:val="0"/>
               <w:spacing w:before="0" w:after="0" w:line="440" w:lineRule="exact"/>
-              <w:ind w:firstLine="0"/>
-              <w:jc w:val="left"/>
-              <w:snapToGrid w:val="0"/>
+              <w:ind w:right="60" w:firstLine="0"/>
+              <w:jc w:val="distribute"/>
             </w:pPr>
             <w:r>
               <w:rPr>
@@ -388,7 +409,6 @@
                 <w:b w:val="0"/>
                 <w:sz w:val="28"/>
                 <w:u w:val="none"/>
-                <w:spacing w:val="280"/>
               </w:rPr>
               <w:t>研究方向</w:t>
             </w:r>
@@ -396,18 +416,18 @@
         </w:tc>
         <w:tc>
           <w:tcPr>
-            <w:tcW w:type="dxa" w:w="2551"/>
+            <w:tcW w:w="3153" w:type="dxa"/>
             <w:vAlign w:val="center"/>
           </w:tcPr>
           <w:p>
             <w:pPr>
+              <w:pBdr>
+                <w:bottom w:val="single" w:color="000000" w:sz="6" w:space="0"/>
+              </w:pBdr>
+              <w:snapToGrid w:val="0"/>
               <w:spacing w:before="0" w:after="0" w:line="440" w:lineRule="exact"/>
               <w:ind w:firstLine="0"/>
               <w:jc w:val="center"/>
-              <w:snapToGrid w:val="0"/>
-              <w:pBdr>
-                <w:bottom w:val="single" w:sz="6" w:space="0" w:color="000000"/>
-              </w:pBdr>
             </w:pPr>
             <w:r>
               <w:rPr>
@@ -423,19 +443,20 @@
       </w:tr>
       <w:tr>
         <w:trPr>
-          <w:trHeight w:val="620" w:hRule="exact"/>
+          <w:trHeight w:val="620" w:hRule="atLeast"/>
         </w:trPr>
         <w:tc>
           <w:tcPr>
-            <w:tcW w:type="dxa" w:w="2013"/>
+            <w:tcW w:w="2072" w:type="dxa"/>
+            <w:noWrap/>
             <w:vAlign w:val="center"/>
           </w:tcPr>
           <w:p>
             <w:pPr>
+              <w:snapToGrid w:val="0"/>
               <w:spacing w:before="0" w:after="0" w:line="440" w:lineRule="exact"/>
-              <w:ind w:firstLine="0"/>
-              <w:jc w:val="left"/>
-              <w:snapToGrid w:val="0"/>
+              <w:ind w:right="60" w:firstLine="0"/>
+              <w:jc w:val="distribute"/>
             </w:pPr>
             <w:r>
               <w:rPr>
@@ -443,7 +464,6 @@
                 <w:b w:val="0"/>
                 <w:sz w:val="28"/>
                 <w:u w:val="none"/>
-                <w:spacing w:val="280"/>
               </w:rPr>
               <w:t>入学时间</w:t>
             </w:r>
@@ -451,18 +471,18 @@
         </w:tc>
         <w:tc>
           <w:tcPr>
-            <w:tcW w:type="dxa" w:w="2551"/>
+            <w:tcW w:w="3153" w:type="dxa"/>
             <w:vAlign w:val="center"/>
           </w:tcPr>
           <w:p>
             <w:pPr>
+              <w:pBdr>
+                <w:bottom w:val="single" w:color="000000" w:sz="6" w:space="0"/>
+              </w:pBdr>
+              <w:snapToGrid w:val="0"/>
               <w:spacing w:before="0" w:after="0" w:line="440" w:lineRule="exact"/>
               <w:ind w:firstLine="0"/>
               <w:jc w:val="center"/>
-              <w:snapToGrid w:val="0"/>
-              <w:pBdr>
-                <w:bottom w:val="single" w:sz="6" w:space="0" w:color="000000"/>
-              </w:pBdr>
             </w:pPr>
             <w:r>
               <w:rPr>
@@ -477,7 +497,6 @@
         </w:tc>
       </w:tr>
     </w:tbl>
-    <w:bookmarkEnd w:id="0"/>
     <w:p>
       <w:pPr>
         <w:rPr>
@@ -496,18 +515,18 @@
     </w:p>
     <w:tbl>
       <w:tblPr>
-        <w:tblW w:type="dxa" w:w="6946"/>
+        <w:tblStyle w:val="7"/>
+        <w:tblW w:w="6397" w:type="dxa"/>
+        <w:tblInd w:w="1507" w:type="dxa"/>
+        <w:tblBorders>
+          <w:top w:val="none" w:color="auto" w:sz="0" w:space="0"/>
+          <w:left w:val="none" w:color="auto" w:sz="0" w:space="0"/>
+          <w:bottom w:val="none" w:color="auto" w:sz="0" w:space="0"/>
+          <w:right w:val="none" w:color="auto" w:sz="0" w:space="0"/>
+          <w:insideH w:val="none" w:color="auto" w:sz="0" w:space="0"/>
+          <w:insideV w:val="none" w:color="auto" w:sz="0" w:space="0"/>
+        </w:tblBorders>
         <w:tblLayout w:type="fixed"/>
-        <w:tblLook w:firstColumn="1" w:firstRow="1" w:lastColumn="0" w:lastRow="0" w:noHBand="0" w:noVBand="1" w:val="04A0"/>
-        <w:tblInd w:w="1219" w:type="dxa"/>
-        <w:tblBorders>
-          <w:top w:val="nil"/>
-          <w:left w:val="nil"/>
-          <w:bottom w:val="nil"/>
-          <w:right w:val="nil"/>
-          <w:insideH w:val="nil"/>
-          <w:insideV w:val="nil"/>
-        </w:tblBorders>
         <w:tblCellMar>
           <w:top w:w="0" w:type="dxa"/>
           <w:left w:w="0" w:type="dxa"/>
@@ -516,24 +535,25 @@
         </w:tblCellMar>
       </w:tblPr>
       <w:tblGrid>
-        <w:gridCol w:w="2013"/>
-        <w:gridCol w:w="4932"/>
+        <w:gridCol w:w="2072"/>
+        <w:gridCol w:w="4325"/>
       </w:tblGrid>
       <w:tr>
         <w:trPr>
-          <w:trHeight w:val="620" w:hRule="exact"/>
+          <w:trHeight w:val="620" w:hRule="atLeast"/>
         </w:trPr>
         <w:tc>
           <w:tcPr>
-            <w:tcW w:type="dxa" w:w="2013"/>
+            <w:tcW w:w="2072" w:type="dxa"/>
+            <w:noWrap/>
             <w:vAlign w:val="center"/>
           </w:tcPr>
           <w:p>
             <w:pPr>
+              <w:snapToGrid w:val="0"/>
               <w:spacing w:before="0" w:after="0" w:line="440" w:lineRule="exact"/>
-              <w:ind w:firstLine="0"/>
-              <w:jc w:val="left"/>
-              <w:snapToGrid w:val="0"/>
+              <w:ind w:right="60" w:firstLine="0"/>
+              <w:jc w:val="distribute"/>
             </w:pPr>
             <w:r>
               <w:rPr>
@@ -541,7 +561,6 @@
                 <w:b w:val="0"/>
                 <w:sz w:val="28"/>
                 <w:u w:val="none"/>
-                <w:spacing w:val="280"/>
               </w:rPr>
               <w:t>论文题目</w:t>
             </w:r>
@@ -549,18 +568,18 @@
         </w:tc>
         <w:tc>
           <w:tcPr>
-            <w:tcW w:type="dxa" w:w="4932"/>
+            <w:tcW w:w="4325" w:type="dxa"/>
             <w:vAlign w:val="center"/>
           </w:tcPr>
           <w:p>
             <w:pPr>
+              <w:pBdr>
+                <w:bottom w:val="single" w:color="000000" w:sz="6" w:space="0"/>
+              </w:pBdr>
+              <w:snapToGrid w:val="0"/>
               <w:spacing w:before="0" w:after="0" w:line="440" w:lineRule="exact"/>
               <w:ind w:firstLine="0"/>
-              <w:jc w:val="center"/>
-              <w:snapToGrid w:val="0"/>
-              <w:pBdr>
-                <w:bottom w:val="single" w:sz="6" w:space="0" w:color="000000"/>
-              </w:pBdr>
+              <w:jc w:val="both"/>
             </w:pPr>
             <w:r>
               <w:rPr>
@@ -569,51 +588,44 @@
                 <w:sz w:val="28"/>
                 <w:u w:val="none"/>
               </w:rPr>
-              <w:t>苏格拉底式智能体辅助阅读对科研新手</w:t>
+              <w:t>苏格拉底式智能体辅助阅读对科研</w:t>
             </w:r>
           </w:p>
         </w:tc>
       </w:tr>
       <w:tr>
         <w:trPr>
-          <w:trHeight w:val="620" w:hRule="exact"/>
+          <w:trHeight w:val="620" w:hRule="atLeast"/>
         </w:trPr>
         <w:tc>
           <w:tcPr>
-            <w:tcW w:type="dxa" w:w="2013"/>
+            <w:tcW w:w="2072" w:type="dxa"/>
+            <w:noWrap/>
             <w:vAlign w:val="center"/>
           </w:tcPr>
           <w:p>
             <w:pPr>
+              <w:snapToGrid w:val="0"/>
               <w:spacing w:before="0" w:after="0" w:line="440" w:lineRule="exact"/>
-              <w:ind w:firstLine="0"/>
-              <w:jc w:val="left"/>
-              <w:snapToGrid w:val="0"/>
-            </w:pPr>
-            <w:r>
-              <w:rPr>
-                <w:rFonts w:ascii="Times New Roman" w:hAnsi="Times New Roman" w:eastAsia="宋体"/>
-                <w:b w:val="0"/>
-                <w:sz w:val="28"/>
-                <w:u w:val="none"/>
-              </w:rPr>
-            </w:r>
+              <w:ind w:right="60" w:firstLine="0"/>
+              <w:jc w:val="distribute"/>
+            </w:pPr>
           </w:p>
         </w:tc>
         <w:tc>
           <w:tcPr>
-            <w:tcW w:type="dxa" w:w="4932"/>
+            <w:tcW w:w="4325" w:type="dxa"/>
             <w:vAlign w:val="center"/>
           </w:tcPr>
           <w:p>
             <w:pPr>
+              <w:pBdr>
+                <w:bottom w:val="single" w:color="000000" w:sz="6" w:space="0"/>
+              </w:pBdr>
+              <w:snapToGrid w:val="0"/>
               <w:spacing w:before="0" w:after="0" w:line="440" w:lineRule="exact"/>
               <w:ind w:firstLine="0"/>
-              <w:jc w:val="center"/>
-              <w:snapToGrid w:val="0"/>
-              <w:pBdr>
-                <w:bottom w:val="single" w:sz="6" w:space="0" w:color="000000"/>
-              </w:pBdr>
+              <w:jc w:val="both"/>
             </w:pPr>
             <w:r>
               <w:rPr>
@@ -622,7 +634,7 @@
                 <w:sz w:val="28"/>
                 <w:u w:val="none"/>
               </w:rPr>
-              <w:t>文献批判性评价表现的影响</w:t>
+              <w:t>新手文献批判性评价表现的影响</w:t>
             </w:r>
           </w:p>
         </w:tc>
@@ -630,64 +642,45 @@
     </w:tbl>
     <w:p>
       <w:pPr>
+        <w:snapToGrid w:val="0"/>
         <w:spacing w:before="0" w:after="0" w:line="20" w:lineRule="exact"/>
         <w:rPr>
           <w:rFonts w:hint="eastAsia"/>
           <w:sz w:val="28"/>
         </w:rPr>
-        <w:snapToGrid w:val="0"/>
       </w:pPr>
-      <w:r>
-        <w:rPr>
-          <w:sz w:val="2"/>
-        </w:rPr>
-      </w:r>
     </w:p>
     <w:p>
       <w:pPr>
+        <w:snapToGrid w:val="0"/>
         <w:spacing w:before="0" w:after="0" w:line="20" w:lineRule="exact"/>
         <w:rPr>
           <w:rFonts w:hint="eastAsia"/>
           <w:sz w:val="28"/>
         </w:rPr>
-        <w:snapToGrid w:val="0"/>
       </w:pPr>
-      <w:r>
-        <w:rPr>
-          <w:sz w:val="2"/>
-        </w:rPr>
-      </w:r>
     </w:p>
     <w:p>
       <w:pPr>
+        <w:snapToGrid w:val="0"/>
         <w:spacing w:before="0" w:after="0" w:line="20" w:lineRule="exact"/>
         <w:rPr>
           <w:rFonts w:hint="eastAsia"/>
         </w:rPr>
-        <w:snapToGrid w:val="0"/>
       </w:pPr>
-      <w:r>
-        <w:rPr>
-          <w:sz w:val="2"/>
-        </w:rPr>
-      </w:r>
     </w:p>
     <w:p>
       <w:pPr>
+        <w:snapToGrid w:val="0"/>
         <w:spacing w:before="0" w:after="0" w:line="20" w:lineRule="exact"/>
         <w:rPr>
           <w:rFonts w:hint="eastAsia"/>
         </w:rPr>
-        <w:snapToGrid w:val="0"/>
       </w:pPr>
-      <w:r>
-        <w:rPr>
-          <w:sz w:val="2"/>
-        </w:rPr>
-      </w:r>
     </w:p>
     <w:p>
       <w:pPr>
+        <w:snapToGrid w:val="0"/>
         <w:spacing w:before="0" w:after="0" w:line="20" w:lineRule="exact"/>
         <w:jc w:val="right"/>
         <w:rPr>
@@ -695,16 +688,11 @@
           <w:sz w:val="24"/>
           <w:szCs w:val="24"/>
         </w:rPr>
-        <w:snapToGrid w:val="0"/>
       </w:pPr>
-      <w:r>
-        <w:rPr>
-          <w:sz w:val="2"/>
-        </w:rPr>
-      </w:r>
     </w:p>
     <w:p>
       <w:pPr>
+        <w:snapToGrid w:val="0"/>
         <w:spacing w:before="0" w:after="0" w:line="20" w:lineRule="exact"/>
         <w:jc w:val="right"/>
         <w:rPr>
@@ -712,45 +700,29 @@
           <w:sz w:val="24"/>
           <w:szCs w:val="24"/>
         </w:rPr>
-        <w:snapToGrid w:val="0"/>
       </w:pPr>
-      <w:r>
-        <w:rPr>
-          <w:sz w:val="2"/>
-        </w:rPr>
-      </w:r>
     </w:p>
     <w:p>
       <w:pPr>
+        <w:snapToGrid w:val="0"/>
         <w:spacing w:before="0" w:after="0" w:line="20" w:lineRule="exact"/>
         <w:rPr>
           <w:rFonts w:hint="eastAsia"/>
           <w:b/>
           <w:sz w:val="28"/>
         </w:rPr>
-        <w:snapToGrid w:val="0"/>
       </w:pPr>
-      <w:r>
-        <w:rPr>
-          <w:sz w:val="2"/>
-        </w:rPr>
-      </w:r>
     </w:p>
     <w:p>
       <w:pPr>
+        <w:snapToGrid w:val="0"/>
         <w:spacing w:before="0" w:after="0" w:line="20" w:lineRule="exact"/>
         <w:rPr>
           <w:rFonts w:hint="eastAsia"/>
           <w:bCs/>
           <w:sz w:val="28"/>
         </w:rPr>
-        <w:snapToGrid w:val="0"/>
       </w:pPr>
-      <w:r>
-        <w:rPr>
-          <w:sz w:val="2"/>
-        </w:rPr>
-      </w:r>
     </w:p>
     <w:p>
       <w:pPr>

</xml_diff>

<commit_message>
Update proposal schedule for April submission
</commit_message>
<xml_diff>
--- a/版本5/彭诗婕202528061023开题报告.docx
+++ b/版本5/彭诗婕202528061023开题报告.docx
@@ -14,8 +14,22 @@
     </w:p>
     <w:p>
       <w:pPr>
-        <w:spacing w:line="480" w:lineRule="auto"/>
+        <w:keepNext w:val="0"/>
+        <w:keepLines w:val="0"/>
+        <w:pageBreakBefore w:val="0"/>
+        <w:widowControl w:val="0"/>
+        <w:kinsoku/>
+        <w:wordWrap/>
+        <w:overflowPunct/>
+        <w:topLinePunct w:val="0"/>
+        <w:autoSpaceDE/>
+        <w:autoSpaceDN/>
+        <w:bidi w:val="0"/>
+        <w:adjustRightInd/>
+        <w:snapToGrid/>
+        <w:spacing w:before="160" w:after="280" w:line="480" w:lineRule="auto"/>
         <w:jc w:val="center"/>
+        <w:textAlignment w:val="auto"/>
         <w:rPr>
           <w:rFonts w:hint="eastAsia" w:ascii="宋体" w:hAnsi="宋体" w:eastAsia="宋体" w:cs="宋体"/>
           <w:b/>
@@ -49,7 +63,7 @@
     </w:p>
     <w:p>
       <w:pPr>
-        <w:spacing w:line="480" w:lineRule="auto"/>
+        <w:spacing w:line="360" w:lineRule="auto"/>
         <w:jc w:val="center"/>
         <w:rPr>
           <w:rFonts w:hint="eastAsia"/>
@@ -67,22 +81,22 @@
         </w:rPr>
         <w:t>硕士研究生学位论文开题报告</w:t>
       </w:r>
-      <w:bookmarkStart w:id="0" w:name="_GoBack"/>
-      <w:bookmarkEnd w:id="0"/>
     </w:p>
     <w:p>
       <w:pPr>
         <w:rPr>
-          <w:rFonts w:hint="eastAsia"/>
-          <w:sz w:val="28"/>
+          <w:rFonts w:hint="eastAsia" w:ascii="宋体" w:hAnsi="宋体" w:eastAsia="宋体" w:cs="宋体"/>
+          <w:sz w:val="48"/>
+          <w:szCs w:val="48"/>
         </w:rPr>
       </w:pPr>
     </w:p>
     <w:p>
       <w:pPr>
         <w:rPr>
-          <w:rFonts w:hint="eastAsia"/>
-          <w:sz w:val="28"/>
+          <w:rFonts w:hint="eastAsia" w:ascii="宋体" w:hAnsi="宋体" w:eastAsia="宋体" w:cs="宋体"/>
+          <w:sz w:val="48"/>
+          <w:szCs w:val="48"/>
         </w:rPr>
       </w:pPr>
     </w:p>
@@ -23582,7 +23596,7 @@
                 <w:color w:val="000000"/>
                 <w:sz w:val="24"/>
               </w:rPr>
-              <w:t>预实验的4名参与者用于发现流程问题和调整材料，不用于估计稳定的训练效应。预实验修改完成后，保留版本记录，确定正式实验的材料、时间、评分手册及Agent配置。</w:t>
+              <w:t>预实验的4名参与者用于发现流程问题和调整材料。预实验修改完成后，保留版本记录，确定正式实验的材料、时间、评分手册及Agent配置。</w:t>
             </w:r>
           </w:p>
           <w:p>
@@ -27462,7 +27476,7 @@
                 <w:color w:val="000000"/>
                 <w:sz w:val="24"/>
               </w:rPr>
-              <w:t>当前主要后测在训练后休息约10分钟进行。延迟后测作为备选安排：若实施，将在正式实验前确定固定间隔，另选同类模拟研究文章D，采用相同任务和评分规则，并统一记录实际间隔。延迟后测另行安排补偿与分析，不纳入本报告当前的主要检验。</w:t>
+              <w:t>当前主要后测在训练后休息约10分钟进行。延迟后测作为备选安排：若实施，将在正式实验前确定固定间隔，另选同类模拟研究文章D，采用相同任务和评分规则，并统一记录实际间隔。</w:t>
             </w:r>
           </w:p>
           <w:p>
@@ -29954,7 +29968,7 @@
                 <w:color w:val="000000"/>
                 <w:sz w:val="24"/>
               </w:rPr>
-              <w:t>对话编码以能够识别的推理片段为单位，结合前后文判断解释来源。研究者制定编码说明，抽取样本由另一名编码者独立核对，处理分歧后汇总各类片段及典型过程。对话用于说明学生如何参与训练，以及系统是否执行了预定策略；本研究不把自我解释设置为正式中介检验。</w:t>
+              <w:t>对话编码以能够识别的推理片段为单位，结合前后文判断解释来源。研究者制定编码说明，抽取样本由另一名编码者独立核对，处理分歧后汇总各类片段及典型过程。对话用于说明学生如何参与训练，以及系统是否执行了预定策。</w:t>
             </w:r>
           </w:p>
           <w:p>
@@ -32301,7 +32315,7 @@
                       <w:color w:val="000000"/>
                       <w:sz w:val="22"/>
                     </w:rPr>
-                    <w:t>完成开题、补充文献与同类工具比较，开展研究一访谈</w:t>
+                    <w:t>完成开题，补充文献与同类工具比较，开展研究一访谈，整理设计要求；同步撰写文献综述与研究设计</w:t>
                   </w:r>
                 </w:p>
               </w:tc>
@@ -32377,7 +32391,7 @@
                       <w:color w:val="000000"/>
                       <w:sz w:val="22"/>
                     </w:rPr>
-                    <w:t>2026年12月—2027年1月</w:t>
+                    <w:t>2026年12月</w:t>
                   </w:r>
                 </w:p>
               </w:tc>
@@ -32412,7 +32426,7 @@
                       <w:color w:val="000000"/>
                       <w:sz w:val="22"/>
                     </w:rPr>
-                    <w:t>完善现有阅读原型与Agent，完成两轮可用性测试</w:t>
+                    <w:t>完善现有阅读原型与Agent，完成两轮可用性测试及迭代，确定实验使用版本</w:t>
                   </w:r>
                 </w:p>
               </w:tc>
@@ -32488,7 +32502,7 @@
                       <w:color w:val="000000"/>
                       <w:sz w:val="22"/>
                     </w:rPr>
-                    <w:t>2027年2月</w:t>
+                    <w:t>2027年1月</w:t>
                   </w:r>
                 </w:p>
               </w:tc>
@@ -32523,7 +32537,7 @@
                       <w:color w:val="000000"/>
                       <w:sz w:val="22"/>
                     </w:rPr>
-                    <w:t>完成材料核对、评分者培训及预实验</w:t>
+                    <w:t>完成材料与评分标准的专家核对、评分者培训及预实验，修订并固定正式流程；启动被试招募</w:t>
                   </w:r>
                 </w:p>
               </w:tc>
@@ -32558,7 +32572,7 @@
                       <w:color w:val="000000"/>
                       <w:sz w:val="22"/>
                     </w:rPr>
-                    <w:t>正式材料包、流程、评分手册</w:t>
+                    <w:t>正式材料包、评分手册、实验流程与招募安排</w:t>
                   </w:r>
                 </w:p>
               </w:tc>
@@ -32599,7 +32613,7 @@
                       <w:color w:val="000000"/>
                       <w:sz w:val="22"/>
                     </w:rPr>
-                    <w:t>2027年3月</w:t>
+                    <w:t>2027年2月</w:t>
                   </w:r>
                 </w:p>
               </w:tc>
@@ -32634,7 +32648,7 @@
                       <w:color w:val="000000"/>
                       <w:sz w:val="22"/>
                     </w:rPr>
-                    <w:t>招募并实施正式实验，同步整理数据与盲评</w:t>
+                    <w:t>完成正式实验，同步整理数据、开展独立盲评与评分一致性检验；完成统计分析与过程分析，撰写结果、讨论及结论，整合全文并提交导师审阅分</w:t>
                   </w:r>
                 </w:p>
               </w:tc>
@@ -32660,16 +32674,41 @@
                     <w:spacing w:before="60" w:after="60" w:line="280" w:lineRule="exact"/>
                     <w:ind w:left="0" w:right="0" w:firstLine="0"/>
                     <w:jc w:val="left"/>
-                  </w:pPr>
-                  <w:r>
-                    <w:rPr>
-                      <w:rFonts w:ascii="Times New Roman" w:hAnsi="Times New Roman" w:eastAsia="宋体"/>
-                      <w:b w:val="0"/>
-                      <w:i w:val="0"/>
-                      <w:color w:val="000000"/>
-                      <w:sz w:val="22"/>
-                    </w:rPr>
-                    <w:t>实验数据、原始评分与过程记录</w:t>
+                    <w:rPr>
+                      <w:rFonts w:hint="eastAsia" w:eastAsia="宋体"/>
+                      <w:lang w:eastAsia="zh-CN"/>
+                    </w:rPr>
+                  </w:pPr>
+                  <w:r>
+                    <w:rPr>
+                      <w:rFonts w:ascii="Times New Roman" w:hAnsi="Times New Roman" w:eastAsia="宋体"/>
+                      <w:b w:val="0"/>
+                      <w:i w:val="0"/>
+                      <w:color w:val="000000"/>
+                      <w:sz w:val="22"/>
+                    </w:rPr>
+                    <w:t>实验数据、评分结果、过程记录与方法章节</w:t>
+                  </w:r>
+                  <w:r>
+                    <w:rPr>
+                      <w:rFonts w:hint="eastAsia" w:eastAsia="宋体"/>
+                      <w:b w:val="0"/>
+                      <w:i w:val="0"/>
+                      <w:color w:val="000000"/>
+                      <w:sz w:val="22"/>
+                      <w:lang w:eastAsia="zh-CN"/>
+                    </w:rPr>
+                    <w:t>、</w:t>
+                  </w:r>
+                  <w:r>
+                    <w:rPr>
+                      <w:rFonts w:ascii="Times New Roman" w:hAnsi="Times New Roman" w:eastAsia="宋体"/>
+                      <w:b w:val="0"/>
+                      <w:i w:val="0"/>
+                      <w:color w:val="000000"/>
+                      <w:sz w:val="22"/>
+                    </w:rPr>
+                    <w:t>分析结果、完整论文初稿</w:t>
                   </w:r>
                 </w:p>
               </w:tc>
@@ -32710,7 +32749,7 @@
                       <w:color w:val="000000"/>
                       <w:sz w:val="22"/>
                     </w:rPr>
-                    <w:t>2027年4月</w:t>
+                    <w:t>2027年3月</w:t>
                   </w:r>
                 </w:p>
               </w:tc>
@@ -32745,7 +32784,7 @@
                       <w:color w:val="000000"/>
                       <w:sz w:val="22"/>
                     </w:rPr>
-                    <w:t>完成统计分析、过程分析与论文初稿</w:t>
+                    <w:t>根据导师意见修改全文，核对数据、图表、引用与格式，完成论文写作及修改</w:t>
                   </w:r>
                 </w:p>
               </w:tc>
@@ -32780,118 +32819,7 @@
                       <w:color w:val="000000"/>
                       <w:sz w:val="22"/>
                     </w:rPr>
-                    <w:t>分析结果、研究报告和论文初稿</w:t>
-                  </w:r>
-                </w:p>
-              </w:tc>
-            </w:tr>
-            <w:tr>
-              <w:trPr>
-                <w:cantSplit/>
-                <w:jc w:val="center"/>
-              </w:trPr>
-              <w:tc>
-                <w:tcPr>
-                  <w:tcW w:w="2268" w:type="dxa"/>
-                  <w:tcBorders>
-                    <w:top w:val="nil"/>
-                    <w:left w:val="nil"/>
-                    <w:bottom w:val="single" w:color="000000" w:sz="8" w:space="0"/>
-                    <w:right w:val="nil"/>
-                    <w:insideH w:val="nil"/>
-                    <w:insideV w:val="nil"/>
-                  </w:tcBorders>
-                  <w:vAlign w:val="center"/>
-                </w:tcPr>
-                <w:p>
-                  <w:pPr>
-                    <w:keepNext w:val="0"/>
-                    <w:keepLines w:val="0"/>
-                    <w:widowControl/>
-                    <w:snapToGrid w:val="0"/>
-                    <w:spacing w:before="60" w:after="60" w:line="280" w:lineRule="exact"/>
-                    <w:ind w:left="0" w:right="0" w:firstLine="0"/>
-                    <w:jc w:val="left"/>
-                  </w:pPr>
-                  <w:r>
-                    <w:rPr>
-                      <w:rFonts w:ascii="Times New Roman" w:hAnsi="Times New Roman" w:eastAsia="宋体"/>
-                      <w:b w:val="0"/>
-                      <w:i w:val="0"/>
-                      <w:color w:val="000000"/>
-                      <w:sz w:val="22"/>
-                    </w:rPr>
-                    <w:t>2027年5—6月</w:t>
-                  </w:r>
-                </w:p>
-              </w:tc>
-              <w:tc>
-                <w:tcPr>
-                  <w:tcW w:w="4535" w:type="dxa"/>
-                  <w:tcBorders>
-                    <w:top w:val="nil"/>
-                    <w:left w:val="nil"/>
-                    <w:bottom w:val="single" w:color="000000" w:sz="8" w:space="0"/>
-                    <w:right w:val="nil"/>
-                    <w:insideH w:val="nil"/>
-                    <w:insideV w:val="nil"/>
-                  </w:tcBorders>
-                  <w:vAlign w:val="center"/>
-                </w:tcPr>
-                <w:p>
-                  <w:pPr>
-                    <w:keepNext w:val="0"/>
-                    <w:keepLines w:val="0"/>
-                    <w:widowControl/>
-                    <w:snapToGrid w:val="0"/>
-                    <w:spacing w:before="60" w:after="60" w:line="280" w:lineRule="exact"/>
-                    <w:ind w:left="0" w:right="0" w:firstLine="0"/>
-                    <w:jc w:val="left"/>
-                  </w:pPr>
-                  <w:r>
-                    <w:rPr>
-                      <w:rFonts w:ascii="Times New Roman" w:hAnsi="Times New Roman" w:eastAsia="宋体"/>
-                      <w:b w:val="0"/>
-                      <w:i w:val="0"/>
-                      <w:color w:val="000000"/>
-                      <w:sz w:val="22"/>
-                    </w:rPr>
-                    <w:t>修改论文、完善系统说明并准备答辩</w:t>
-                  </w:r>
-                </w:p>
-              </w:tc>
-              <w:tc>
-                <w:tcPr>
-                  <w:tcW w:w="3118" w:type="dxa"/>
-                  <w:tcBorders>
-                    <w:top w:val="nil"/>
-                    <w:left w:val="nil"/>
-                    <w:bottom w:val="single" w:color="000000" w:sz="8" w:space="0"/>
-                    <w:right w:val="nil"/>
-                    <w:insideH w:val="nil"/>
-                    <w:insideV w:val="nil"/>
-                  </w:tcBorders>
-                  <w:vAlign w:val="center"/>
-                </w:tcPr>
-                <w:p>
-                  <w:pPr>
-                    <w:keepNext w:val="0"/>
-                    <w:keepLines w:val="0"/>
-                    <w:widowControl/>
-                    <w:snapToGrid w:val="0"/>
-                    <w:spacing w:before="60" w:after="60" w:line="280" w:lineRule="exact"/>
-                    <w:ind w:left="0" w:right="0" w:firstLine="0"/>
-                    <w:jc w:val="left"/>
-                  </w:pPr>
-                  <w:r>
-                    <w:rPr>
-                      <w:rFonts w:ascii="Times New Roman" w:hAnsi="Times New Roman" w:eastAsia="宋体"/>
-                      <w:b w:val="0"/>
-                      <w:i w:val="0"/>
-                      <w:color w:val="000000"/>
-                      <w:sz w:val="22"/>
-                    </w:rPr>
-                    <w:t>学位论文、系统与答辩材料</w:t>
+                    <w:t>完成修改的论文与配套材料</w:t>
                   </w:r>
                 </w:p>
               </w:tc>
@@ -32911,8 +32839,6 @@
               <w:spacing w:before="0" w:after="80" w:line="360" w:lineRule="exact"/>
               <w:ind w:left="0" w:right="0" w:firstLine="480"/>
               <w:jc w:val="both"/>
-            </w:pPr>
-            <w:r>
               <w:rPr>
                 <w:rFonts w:ascii="Times New Roman" w:hAnsi="Times New Roman" w:eastAsia="宋体"/>
                 <w:b w:val="0"/>
@@ -32920,8 +32846,53 @@
                 <w:color w:val="000000"/>
                 <w:sz w:val="24"/>
               </w:rPr>
-              <w:t>以上为拟定安排，具体节点与培养单位后续通知衔接。</w:t>
-            </w:r>
+            </w:pPr>
+            <w:r>
+              <w:rPr>
+                <w:rFonts w:ascii="Times New Roman" w:hAnsi="Times New Roman" w:eastAsia="宋体"/>
+                <w:b w:val="0"/>
+                <w:i w:val="0"/>
+                <w:color w:val="000000"/>
+                <w:sz w:val="24"/>
+              </w:rPr>
+              <w:t>文献综述、研究方法等章节随研究进展同步撰写，预答辩后根据反馈及学校安排完成后续修改与正式答辩准备。</w:t>
+            </w:r>
+          </w:p>
+          <w:p>
+            <w:pPr>
+              <w:keepNext w:val="0"/>
+              <w:keepLines w:val="0"/>
+              <w:widowControl/>
+              <w:snapToGrid w:val="0"/>
+              <w:spacing w:before="0" w:after="80" w:line="360" w:lineRule="exact"/>
+              <w:ind w:left="0" w:right="0" w:firstLine="480"/>
+              <w:jc w:val="both"/>
+              <w:rPr>
+                <w:rFonts w:ascii="Times New Roman" w:hAnsi="Times New Roman" w:eastAsia="宋体"/>
+                <w:b w:val="0"/>
+                <w:i w:val="0"/>
+                <w:color w:val="000000"/>
+                <w:sz w:val="24"/>
+              </w:rPr>
+            </w:pPr>
+          </w:p>
+          <w:p>
+            <w:pPr>
+              <w:keepNext w:val="0"/>
+              <w:keepLines w:val="0"/>
+              <w:widowControl/>
+              <w:snapToGrid w:val="0"/>
+              <w:spacing w:before="0" w:after="80" w:line="360" w:lineRule="exact"/>
+              <w:ind w:right="0"/>
+              <w:jc w:val="both"/>
+              <w:rPr>
+                <w:rFonts w:ascii="Times New Roman" w:hAnsi="Times New Roman" w:eastAsia="宋体"/>
+                <w:b w:val="0"/>
+                <w:i w:val="0"/>
+                <w:color w:val="000000"/>
+                <w:sz w:val="24"/>
+              </w:rPr>
+            </w:pPr>
           </w:p>
           <w:p>
             <w:pPr>
@@ -35326,8 +35297,6 @@
               <w:spacing w:before="0" w:after="80" w:line="360" w:lineRule="exact"/>
               <w:ind w:left="0" w:right="0" w:firstLine="480"/>
               <w:jc w:val="both"/>
-            </w:pPr>
-            <w:r>
               <w:rPr>
                 <w:rFonts w:ascii="Times New Roman" w:hAnsi="Times New Roman" w:eastAsia="宋体"/>
                 <w:b w:val="0"/>
@@ -35335,8 +35304,55 @@
                 <w:color w:val="000000"/>
                 <w:sz w:val="24"/>
               </w:rPr>
+            </w:pPr>
+            <w:r>
+              <w:rPr>
+                <w:rFonts w:ascii="Times New Roman" w:hAnsi="Times New Roman" w:eastAsia="宋体"/>
+                <w:b w:val="0"/>
+                <w:i w:val="0"/>
+                <w:color w:val="000000"/>
+                <w:sz w:val="24"/>
+              </w:rPr>
               <w:t>预算对应当前主要研究安排，参与者补偿和评分劳务均按计划招募100人预留。量表授权如产生额外费用，及备选延迟后测的补偿，将在实施前另行核定。</w:t>
             </w:r>
+          </w:p>
+          <w:p>
+            <w:pPr>
+              <w:keepNext w:val="0"/>
+              <w:keepLines w:val="0"/>
+              <w:widowControl/>
+              <w:snapToGrid w:val="0"/>
+              <w:spacing w:before="0" w:after="80" w:line="360" w:lineRule="exact"/>
+              <w:ind w:left="0" w:right="0" w:firstLine="480"/>
+              <w:jc w:val="both"/>
+              <w:rPr>
+                <w:rFonts w:ascii="Times New Roman" w:hAnsi="Times New Roman" w:eastAsia="宋体"/>
+                <w:b w:val="0"/>
+                <w:i w:val="0"/>
+                <w:color w:val="000000"/>
+                <w:sz w:val="24"/>
+              </w:rPr>
+            </w:pPr>
+          </w:p>
+          <w:p>
+            <w:pPr>
+              <w:keepNext w:val="0"/>
+              <w:keepLines w:val="0"/>
+              <w:widowControl/>
+              <w:snapToGrid w:val="0"/>
+              <w:spacing w:before="0" w:after="80" w:line="360" w:lineRule="exact"/>
+              <w:ind w:left="0" w:right="0" w:firstLine="480"/>
+              <w:jc w:val="both"/>
+              <w:rPr>
+                <w:rFonts w:ascii="Times New Roman" w:hAnsi="Times New Roman" w:eastAsia="宋体"/>
+                <w:b w:val="0"/>
+                <w:i w:val="0"/>
+                <w:color w:val="000000"/>
+                <w:sz w:val="24"/>
+              </w:rPr>
+            </w:pPr>
+            <w:bookmarkStart w:id="0" w:name="_GoBack"/>
+            <w:bookmarkEnd w:id="0"/>
           </w:p>
           <w:p>
             <w:pPr>
@@ -35358,18 +35374,6 @@
                 <w:sz w:val="28"/>
               </w:rPr>
               <w:t>三、论文大纲</w:t>
-            </w:r>
-            <w:r>
-              <w:rPr>
-                <w:rFonts w:hint="eastAsia" w:ascii="Times New Roman" w:hAnsi="Times New Roman" w:eastAsia="宋体"/>
-                <w:b/>
-                <w:bCs/>
-                <w:i w:val="0"/>
-                <w:color w:val="000000"/>
-                <w:sz w:val="28"/>
-                <w:szCs w:val="21"/>
-              </w:rPr>
-              <w:t>（可加页）</w:t>
             </w:r>
           </w:p>
           <w:p>
@@ -36249,8 +36253,6 @@
               <w:spacing w:before="0" w:after="40" w:line="320" w:lineRule="exact"/>
               <w:ind w:left="0" w:right="0" w:firstLine="360"/>
               <w:jc w:val="both"/>
-            </w:pPr>
-            <w:r>
               <w:rPr>
                 <w:rFonts w:ascii="Times New Roman" w:hAnsi="Times New Roman" w:eastAsia="宋体"/>
                 <w:b w:val="0"/>
@@ -36258,8 +36260,35 @@
                 <w:color w:val="000000"/>
                 <w:sz w:val="24"/>
               </w:rPr>
+            </w:pPr>
+            <w:r>
+              <w:rPr>
+                <w:rFonts w:ascii="Times New Roman" w:hAnsi="Times New Roman" w:eastAsia="宋体"/>
+                <w:b w:val="0"/>
+                <w:i w:val="0"/>
+                <w:color w:val="000000"/>
+                <w:sz w:val="24"/>
+              </w:rPr>
               <w:t>附录：访谈提纲、可用性测试材料、实验指导语、评分手册及Agent交互规则</w:t>
             </w:r>
+          </w:p>
+          <w:p>
+            <w:pPr>
+              <w:keepNext w:val="0"/>
+              <w:keepLines w:val="0"/>
+              <w:widowControl/>
+              <w:snapToGrid w:val="0"/>
+              <w:spacing w:before="0" w:after="40" w:line="320" w:lineRule="exact"/>
+              <w:ind w:left="0" w:right="0" w:firstLine="360"/>
+              <w:jc w:val="both"/>
+              <w:rPr>
+                <w:rFonts w:ascii="Times New Roman" w:hAnsi="Times New Roman" w:eastAsia="宋体"/>
+                <w:b w:val="0"/>
+                <w:i w:val="0"/>
+                <w:color w:val="000000"/>
+                <w:sz w:val="24"/>
+              </w:rPr>
+            </w:pPr>
           </w:p>
           <w:p>
             <w:pPr>

</xml_diff>